<commit_message>
content(i18n): complete the French and Spanish translations
- add the three missing About page image descriptions (FR + ES)
- translate the ten image descriptions that were still English in the FR/ES
  dictionaries (property cross-link, private client hero + service images)
- regenerate the shared copy document: 0 untranslated texts in either language
</commit_message>
<xml_diff>
--- a/docs/12-copy-all-languages.docx
+++ b/docs/12-copy-all-languages.docx
@@ -5900,13 +5900,13 @@
         <w:br/>
       </w:r>
       <w:r>
-        <w:t xml:space="preserve">FR — —</w:t>
-      </w:r>
-      <w:r>
-        <w:br/>
-      </w:r>
-      <w:r>
-        <w:t xml:space="preserve">ES — —</w:t>
+        <w:t xml:space="preserve">FR — Étagères voûtées du bureau boutique, vases en pierre et lumière chaleureuse</w:t>
+      </w:r>
+      <w:r>
+        <w:br/>
+      </w:r>
+      <w:r>
+        <w:t xml:space="preserve">ES — Estanterías arqueadas de la oficina boutique con jarrones de piedra y luz cálida</w:t>
       </w:r>
     </w:p>
     <w:p>
@@ -5933,13 +5933,13 @@
         <w:br/>
       </w:r>
       <w:r>
-        <w:t xml:space="preserve">FR — —</w:t>
-      </w:r>
-      <w:r>
-        <w:br/>
-      </w:r>
-      <w:r>
-        <w:t xml:space="preserve">ES — —</w:t>
+        <w:t xml:space="preserve">FR — Bibliothèque avec livres de droit et plans d’architecture, évoquant l’héritage et la vision</w:t>
+      </w:r>
+      <w:r>
+        <w:br/>
+      </w:r>
+      <w:r>
+        <w:t xml:space="preserve">ES — Biblioteca con libros de derecho y planos de arquitectura que representan legado y visión</w:t>
       </w:r>
     </w:p>
     <w:p>
@@ -5966,13 +5966,13 @@
         <w:br/>
       </w:r>
       <w:r>
-        <w:t xml:space="preserve">FR — —</w:t>
-      </w:r>
-      <w:r>
-        <w:br/>
-      </w:r>
-      <w:r>
-        <w:t xml:space="preserve">ES — —</w:t>
+        <w:t xml:space="preserve">FR — Centro de Divulgación Musical del Mediterráneo</w:t>
+      </w:r>
+      <w:r>
+        <w:br/>
+      </w:r>
+      <w:r>
+        <w:t xml:space="preserve">ES — Centro de Divulgación Musical del Mediterráneo</w:t>
       </w:r>
     </w:p>
     <w:bookmarkEnd w:id="44"/>
@@ -8855,13 +8855,13 @@
         <w:br/>
       </w:r>
       <w:r>
-        <w:t xml:space="preserve">FR — Limestone hallway with law books opening to sea terrace</w:t>
-      </w:r>
-      <w:r>
-        <w:br/>
-      </w:r>
-      <w:r>
-        <w:t xml:space="preserve">ES — Limestone hallway with law books opening to sea terrace</w:t>
+        <w:t xml:space="preserve">FR — Couloir en pierre calcaire avec livres de droit ouvrant sur une terrasse face à la mer</w:t>
+      </w:r>
+      <w:r>
+        <w:br/>
+      </w:r>
+      <w:r>
+        <w:t xml:space="preserve">ES — Pasillo de piedra caliza con libros de derecho que se abre a una terraza frente al mar</w:t>
       </w:r>
     </w:p>
     <w:p>
@@ -9130,13 +9130,13 @@
         <w:br/>
       </w:r>
       <w:r>
-        <w:t xml:space="preserve">FR — Terrace with olive tree overlooking the sea</w:t>
-      </w:r>
-      <w:r>
-        <w:br/>
-      </w:r>
-      <w:r>
-        <w:t xml:space="preserve">ES — Terrace with olive tree overlooking the sea</w:t>
+        <w:t xml:space="preserve">FR — Terrasse avec olivier surplombant la mer</w:t>
+      </w:r>
+      <w:r>
+        <w:br/>
+      </w:r>
+      <w:r>
+        <w:t xml:space="preserve">ES — Terraza con olivo con vistas al mar</w:t>
       </w:r>
     </w:p>
     <w:p>
@@ -9674,13 +9674,13 @@
         <w:br/>
       </w:r>
       <w:r>
-        <w:t xml:space="preserve">FR — Silver suitcase in a cream stone corridor</w:t>
-      </w:r>
-      <w:r>
-        <w:br/>
-      </w:r>
-      <w:r>
-        <w:t xml:space="preserve">ES — Silver suitcase in a cream stone corridor</w:t>
+        <w:t xml:space="preserve">FR — Valise en argent dans un couloir en pierre claire</w:t>
+      </w:r>
+      <w:r>
+        <w:br/>
+      </w:r>
+      <w:r>
+        <w:t xml:space="preserve">ES — Maleta plateada en un pasillo de piedra clara</w:t>
       </w:r>
     </w:p>
     <w:bookmarkEnd w:id="65"/>
@@ -9816,13 +9816,13 @@
         <w:br/>
       </w:r>
       <w:r>
-        <w:t xml:space="preserve">FR — Private pool terrace with loungers and a bay view</w:t>
-      </w:r>
-      <w:r>
-        <w:br/>
-      </w:r>
-      <w:r>
-        <w:t xml:space="preserve">ES — Private pool terrace with loungers and a bay view</w:t>
+        <w:t xml:space="preserve">FR — Terrasse privée avec piscine, chaises longues et vue sur la baie</w:t>
+      </w:r>
+      <w:r>
+        <w:br/>
+      </w:r>
+      <w:r>
+        <w:t xml:space="preserve">ES — Terraza privada con piscina, tumbonas y vistas a la bahía</w:t>
       </w:r>
     </w:p>
     <w:bookmarkEnd w:id="66"/>
@@ -9958,13 +9958,13 @@
         <w:br/>
       </w:r>
       <w:r>
-        <w:t xml:space="preserve">FR — Architect table with blueprints and stone samples in a limestone villa under renovation</w:t>
-      </w:r>
-      <w:r>
-        <w:br/>
-      </w:r>
-      <w:r>
-        <w:t xml:space="preserve">ES — Architect table with blueprints and stone samples in a limestone villa under renovation</w:t>
+        <w:t xml:space="preserve">FR — Table d’architecte avec plans et échantillons de pierre dans une villa en pierre calcaire en cours de rénovation</w:t>
+      </w:r>
+      <w:r>
+        <w:br/>
+      </w:r>
+      <w:r>
+        <w:t xml:space="preserve">ES — Mesa de arquitecto con planos y muestras de piedra en una villa de piedra caliza en reforma</w:t>
       </w:r>
     </w:p>
     <w:bookmarkEnd w:id="67"/>
@@ -10100,13 +10100,13 @@
         <w:br/>
       </w:r>
       <w:r>
-        <w:t xml:space="preserve">FR — Golf lake at Villa Padierna, Marbella</w:t>
-      </w:r>
-      <w:r>
-        <w:br/>
-      </w:r>
-      <w:r>
-        <w:t xml:space="preserve">ES — Golf lake at Villa Padierna, Marbella</w:t>
+        <w:t xml:space="preserve">FR — Lac du golf de Villa Padierna, Marbella</w:t>
+      </w:r>
+      <w:r>
+        <w:br/>
+      </w:r>
+      <w:r>
+        <w:t xml:space="preserve">ES — Lago del golf de Villa Padierna, Marbella</w:t>
       </w:r>
     </w:p>
     <w:p>
@@ -10929,109 +10929,35 @@
           <w:b/>
           <w:bCs/>
         </w:rPr>
-        <w:t xml:space="preserve">French (FR) — 3 text(s)</w:t>
-      </w:r>
-    </w:p>
-    <w:p>
-      <w:pPr>
-        <w:pStyle w:val="Compact"/>
-        <w:numPr>
-          <w:ilvl w:val="0"/>
-          <w:numId w:val="1002"/>
-        </w:numPr>
-      </w:pPr>
-      <w:r>
-        <w:rPr>
-          <w:rStyle w:val="VerbatimChar"/>
-        </w:rPr>
-        <w:t xml:space="preserve">about.alts.hero</w:t>
-      </w:r>
-    </w:p>
-    <w:p>
-      <w:pPr>
-        <w:pStyle w:val="Compact"/>
-        <w:numPr>
-          <w:ilvl w:val="0"/>
-          <w:numId w:val="1002"/>
-        </w:numPr>
-      </w:pPr>
-      <w:r>
-        <w:rPr>
-          <w:rStyle w:val="VerbatimChar"/>
-        </w:rPr>
-        <w:t xml:space="preserve">about.alts.legacy</w:t>
-      </w:r>
-    </w:p>
-    <w:p>
-      <w:pPr>
-        <w:pStyle w:val="Compact"/>
-        <w:numPr>
-          <w:ilvl w:val="0"/>
-          <w:numId w:val="1002"/>
-        </w:numPr>
-      </w:pPr>
-      <w:r>
-        <w:rPr>
-          <w:rStyle w:val="VerbatimChar"/>
-        </w:rPr>
-        <w:t xml:space="preserve">about.alts.culture</w:t>
-      </w:r>
-    </w:p>
-    <w:p>
-      <w:pPr>
-        <w:pStyle w:val="FirstParagraph"/>
-      </w:pPr>
-      <w:r>
-        <w:rPr>
-          <w:b/>
-          <w:bCs/>
-        </w:rPr>
-        <w:t xml:space="preserve">Spanish (ES) — 3 text(s)</w:t>
-      </w:r>
-    </w:p>
-    <w:p>
-      <w:pPr>
-        <w:pStyle w:val="Compact"/>
-        <w:numPr>
-          <w:ilvl w:val="0"/>
-          <w:numId w:val="1003"/>
-        </w:numPr>
-      </w:pPr>
-      <w:r>
-        <w:rPr>
-          <w:rStyle w:val="VerbatimChar"/>
-        </w:rPr>
-        <w:t xml:space="preserve">about.alts.hero</w:t>
-      </w:r>
-    </w:p>
-    <w:p>
-      <w:pPr>
-        <w:pStyle w:val="Compact"/>
-        <w:numPr>
-          <w:ilvl w:val="0"/>
-          <w:numId w:val="1003"/>
-        </w:numPr>
-      </w:pPr>
-      <w:r>
-        <w:rPr>
-          <w:rStyle w:val="VerbatimChar"/>
-        </w:rPr>
-        <w:t xml:space="preserve">about.alts.legacy</w:t>
-      </w:r>
-    </w:p>
-    <w:p>
-      <w:pPr>
-        <w:pStyle w:val="Compact"/>
-        <w:numPr>
-          <w:ilvl w:val="0"/>
-          <w:numId w:val="1003"/>
-        </w:numPr>
-      </w:pPr>
-      <w:r>
-        <w:rPr>
-          <w:rStyle w:val="VerbatimChar"/>
-        </w:rPr>
-        <w:t xml:space="preserve">about.alts.culture</w:t>
+        <w:t xml:space="preserve">French (FR) — 0 text(s)</w:t>
+      </w:r>
+    </w:p>
+    <w:p>
+      <w:pPr>
+        <w:pStyle w:val="BodyText"/>
+      </w:pPr>
+      <w:r>
+        <w:t xml:space="preserve">— none, all translated.</w:t>
+      </w:r>
+    </w:p>
+    <w:p>
+      <w:pPr>
+        <w:pStyle w:val="BodyText"/>
+      </w:pPr>
+      <w:r>
+        <w:rPr>
+          <w:b/>
+          <w:bCs/>
+        </w:rPr>
+        <w:t xml:space="preserve">Spanish (ES) — 0 text(s)</w:t>
+      </w:r>
+    </w:p>
+    <w:p>
+      <w:pPr>
+        <w:pStyle w:val="BodyText"/>
+      </w:pPr>
+      <w:r>
+        <w:t xml:space="preserve">— none, all translated.</w:t>
       </w:r>
     </w:p>
     <w:bookmarkEnd w:id="70"/>
@@ -11221,12 +11147,6 @@
     <w:abstractNumId w:val="990"/>
   </w:num>
   <w:num w:numId="1001">
-    <w:abstractNumId w:val="991"/>
-  </w:num>
-  <w:num w:numId="1002">
-    <w:abstractNumId w:val="991"/>
-  </w:num>
-  <w:num w:numId="1003">
     <w:abstractNumId w:val="991"/>
   </w:num>
 </w:numbering>

</xml_diff>